<commit_message>
Milestone 9: end-to-end dry runs (checkout, SRM, CUPED), tracecheck, fixes found by the runs
Co-Authored-By: Claude Opus 5.5 <noreply@anthropic.com>
</commit_message>
<xml_diff>
--- a/docs/sample/sample_summary.docx
+++ b/docs/sample/sample_summary.docx
@@ -131,7 +131,7 @@
         <w:rPr>
           <w:b/>
         </w:rPr>
-        <w:t xml:space="preserve">checkout conversion: </w:t>
+        <w:t xml:space="preserve">Checkout conversion: </w:t>
       </w:r>
       <w:r>
         <w:t>control vs treatment: 34.25% vs 35.34%</w:t>
@@ -3266,6 +3266,11 @@
       </w:r>
     </w:p>
     <w:p>
+      <w:r>
+        <w:t>Review. Earlier rounds are in review.md.</w:t>
+      </w:r>
+    </w:p>
+    <w:p>
       <w:pPr>
         <w:pStyle w:val="ListBullet"/>
       </w:pPr>

</xml_diff>